<commit_message>
Fix Cau 1 C1-P1-TH-069: Bo sung hinh ve cong thuc ester X va cap nhat loi giai chi tiet chuan GDPT 2018
</commit_message>
<xml_diff>
--- a/San_Pham/De_Kiem_Tra_GK1_Hoa_12_De20_Azota.docx
+++ b/San_Pham/De_Kiem_Tra_GK1_Hoa_12_De20_Azota.docx
@@ -48,6 +48,46 @@
     </w:p>
     <w:p>
       <w:pPr>
+        <w:spacing w:before="40" w:after="40"/>
+        <w:jc w:val="center"/>
+      </w:pPr>
+      <w:r>
+        <w:drawing>
+          <wp:inline xmlns:a="http://schemas.openxmlformats.org/drawingml/2006/main" xmlns:pic="http://schemas.openxmlformats.org/drawingml/2006/picture">
+            <wp:extent cx="2340000" cy="1216800"/>
+            <wp:docPr id="1" name="Picture 1"/>
+            <wp:cNvGraphicFramePr>
+              <a:graphicFrameLocks noChangeAspect="1"/>
+            </wp:cNvGraphicFramePr>
+            <a:graphic>
+              <a:graphicData uri="http://schemas.openxmlformats.org/drawingml/2006/picture">
+                <pic:pic>
+                  <pic:nvPicPr>
+                    <pic:cNvPr id="0" name="C1_Q069_1.png"/>
+                    <pic:cNvPicPr/>
+                  </pic:nvPicPr>
+                  <pic:blipFill>
+                    <a:blip r:embed="rId9"/>
+                    <a:stretch>
+                      <a:fillRect/>
+                    </a:stretch>
+                  </pic:blipFill>
+                  <pic:spPr>
+                    <a:xfrm>
+                      <a:off x="0" y="0"/>
+                      <a:ext cx="2340000" cy="1216800"/>
+                    </a:xfrm>
+                    <a:prstGeom prst="rect"/>
+                  </pic:spPr>
+                </pic:pic>
+              </a:graphicData>
+            </a:graphic>
+          </wp:inline>
+        </w:drawing>
+      </w:r>
+    </w:p>
+    <w:p>
+      <w:pPr>
         <w:spacing w:before="20" w:after="40"/>
       </w:pPr>
       <w:r>
@@ -355,7 +395,715 @@
           <w:sz w:val="24"/>
           <w:u w:val="none"/>
         </w:rPr>
-        <w:t>a) Sai Ester không tạo liên kết hydrogen mạnh với nước.</w:t>
+        <w:t>Công thức cấu tạo của ester X là CH</w:t>
+      </w:r>
+      <w:r>
+        <w:rPr>
+          <w:rFonts w:ascii="Times New Roman" w:hAnsi="Times New Roman"/>
+          <w:b w:val="0"/>
+          <w:i w:val="0"/>
+          <w:sz w:val="24"/>
+          <w:u w:val="none"/>
+          <w:vertAlign w:val="subscript"/>
+        </w:rPr>
+        <w:t>3</w:t>
+      </w:r>
+      <w:r>
+        <w:rPr>
+          <w:rFonts w:ascii="Times New Roman" w:hAnsi="Times New Roman"/>
+          <w:b w:val="0"/>
+          <w:i w:val="0"/>
+          <w:sz w:val="24"/>
+          <w:u w:val="none"/>
+        </w:rPr>
+        <w:t>COOCH</w:t>
+      </w:r>
+      <w:r>
+        <w:rPr>
+          <w:rFonts w:ascii="Times New Roman" w:hAnsi="Times New Roman"/>
+          <w:b w:val="0"/>
+          <w:i w:val="0"/>
+          <w:sz w:val="24"/>
+          <w:u w:val="none"/>
+          <w:vertAlign w:val="subscript"/>
+        </w:rPr>
+        <w:t>2</w:t>
+      </w:r>
+      <w:r>
+        <w:rPr>
+          <w:rFonts w:ascii="Times New Roman" w:hAnsi="Times New Roman"/>
+          <w:b w:val="0"/>
+          <w:i w:val="0"/>
+          <w:sz w:val="24"/>
+          <w:u w:val="none"/>
+        </w:rPr>
+        <w:t>CH(CH</w:t>
+      </w:r>
+      <w:r>
+        <w:rPr>
+          <w:rFonts w:ascii="Times New Roman" w:hAnsi="Times New Roman"/>
+          <w:b w:val="0"/>
+          <w:i w:val="0"/>
+          <w:sz w:val="24"/>
+          <w:u w:val="none"/>
+          <w:vertAlign w:val="subscript"/>
+        </w:rPr>
+        <w:t>3</w:t>
+      </w:r>
+      <w:r>
+        <w:rPr>
+          <w:rFonts w:ascii="Times New Roman" w:hAnsi="Times New Roman"/>
+          <w:b w:val="0"/>
+          <w:i w:val="0"/>
+          <w:sz w:val="24"/>
+          <w:u w:val="none"/>
+        </w:rPr>
+        <w:t>)CH</w:t>
+      </w:r>
+      <w:r>
+        <w:rPr>
+          <w:rFonts w:ascii="Times New Roman" w:hAnsi="Times New Roman"/>
+          <w:b w:val="0"/>
+          <w:i w:val="0"/>
+          <w:sz w:val="24"/>
+          <w:u w:val="none"/>
+          <w:vertAlign w:val="subscript"/>
+        </w:rPr>
+        <w:t>2</w:t>
+      </w:r>
+      <w:r>
+        <w:rPr>
+          <w:rFonts w:ascii="Times New Roman" w:hAnsi="Times New Roman"/>
+          <w:b w:val="0"/>
+          <w:i w:val="0"/>
+          <w:sz w:val="24"/>
+          <w:u w:val="none"/>
+        </w:rPr>
+        <w:t>CH</w:t>
+      </w:r>
+      <w:r>
+        <w:rPr>
+          <w:rFonts w:ascii="Times New Roman" w:hAnsi="Times New Roman"/>
+          <w:b w:val="0"/>
+          <w:i w:val="0"/>
+          <w:sz w:val="24"/>
+          <w:u w:val="none"/>
+          <w:vertAlign w:val="subscript"/>
+        </w:rPr>
+        <w:t>3</w:t>
+      </w:r>
+      <w:r>
+        <w:rPr>
+          <w:rFonts w:ascii="Times New Roman" w:hAnsi="Times New Roman"/>
+          <w:b w:val="0"/>
+          <w:i w:val="0"/>
+          <w:sz w:val="24"/>
+          <w:u w:val="none"/>
+        </w:rPr>
+        <w:t xml:space="preserve"> (2-methylbutyl acetate).</w:t>
+      </w:r>
+    </w:p>
+    <w:p>
+      <w:pPr>
+        <w:spacing w:before="20" w:after="40"/>
+      </w:pPr>
+      <w:r>
+        <w:rPr>
+          <w:rFonts w:ascii="Times New Roman" w:hAnsi="Times New Roman"/>
+          <w:b w:val="0"/>
+          <w:i w:val="0"/>
+          <w:sz w:val="24"/>
+          <w:u w:val="none"/>
+        </w:rPr>
+        <w:t>Phân tích từng nhận định:</w:t>
+      </w:r>
+    </w:p>
+    <w:p>
+      <w:pPr>
+        <w:spacing w:before="20" w:after="40"/>
+      </w:pPr>
+      <w:r>
+        <w:rPr>
+          <w:rFonts w:ascii="Times New Roman" w:hAnsi="Times New Roman"/>
+          <w:b w:val="0"/>
+          <w:i w:val="0"/>
+          <w:sz w:val="24"/>
+          <w:u w:val="none"/>
+        </w:rPr>
+        <w:t>(a) ĐÚNG. Phân tử X gồm 7C, 14H và 2O, mạch hở chứa 1 nhóm ester (-COO-) và gốc hydrocarbon no nên X là ester no, đơn chức, có công thức phân tử là C</w:t>
+      </w:r>
+      <w:r>
+        <w:rPr>
+          <w:rFonts w:ascii="Times New Roman" w:hAnsi="Times New Roman"/>
+          <w:b w:val="0"/>
+          <w:i w:val="0"/>
+          <w:sz w:val="24"/>
+          <w:u w:val="none"/>
+          <w:vertAlign w:val="subscript"/>
+        </w:rPr>
+        <w:t>7</w:t>
+      </w:r>
+      <w:r>
+        <w:rPr>
+          <w:rFonts w:ascii="Times New Roman" w:hAnsi="Times New Roman"/>
+          <w:b w:val="0"/>
+          <w:i w:val="0"/>
+          <w:sz w:val="24"/>
+          <w:u w:val="none"/>
+        </w:rPr>
+        <w:t>H</w:t>
+      </w:r>
+      <w:r>
+        <w:rPr>
+          <w:rFonts w:ascii="Times New Roman" w:hAnsi="Times New Roman"/>
+          <w:b w:val="0"/>
+          <w:i w:val="0"/>
+          <w:sz w:val="24"/>
+          <w:u w:val="none"/>
+          <w:vertAlign w:val="subscript"/>
+        </w:rPr>
+        <w:t>14</w:t>
+      </w:r>
+      <w:r>
+        <w:rPr>
+          <w:rFonts w:ascii="Times New Roman" w:hAnsi="Times New Roman"/>
+          <w:b w:val="0"/>
+          <w:i w:val="0"/>
+          <w:sz w:val="24"/>
+          <w:u w:val="none"/>
+        </w:rPr>
+        <w:t>O</w:t>
+      </w:r>
+      <w:r>
+        <w:rPr>
+          <w:rFonts w:ascii="Times New Roman" w:hAnsi="Times New Roman"/>
+          <w:b w:val="0"/>
+          <w:i w:val="0"/>
+          <w:sz w:val="24"/>
+          <w:u w:val="none"/>
+          <w:vertAlign w:val="subscript"/>
+        </w:rPr>
+        <w:t>2</w:t>
+      </w:r>
+      <w:r>
+        <w:rPr>
+          <w:rFonts w:ascii="Times New Roman" w:hAnsi="Times New Roman"/>
+          <w:b w:val="0"/>
+          <w:i w:val="0"/>
+          <w:sz w:val="24"/>
+          <w:u w:val="none"/>
+        </w:rPr>
+        <w:t>.</w:t>
+      </w:r>
+    </w:p>
+    <w:p>
+      <w:pPr>
+        <w:spacing w:before="20" w:after="40"/>
+      </w:pPr>
+      <w:r>
+        <w:rPr>
+          <w:rFonts w:ascii="Times New Roman" w:hAnsi="Times New Roman"/>
+          <w:b w:val="0"/>
+          <w:i w:val="0"/>
+          <w:sz w:val="24"/>
+          <w:u w:val="none"/>
+        </w:rPr>
+        <w:t>(b) ĐÚNG. Ester X bị thuỷ phân thuận nghịch trong môi trường acid (H</w:t>
+      </w:r>
+      <w:r>
+        <w:rPr>
+          <w:rFonts w:ascii="Times New Roman" w:hAnsi="Times New Roman"/>
+          <w:b w:val="0"/>
+          <w:i w:val="0"/>
+          <w:sz w:val="24"/>
+          <w:u w:val="none"/>
+          <w:vertAlign w:val="subscript"/>
+        </w:rPr>
+        <w:t>2</w:t>
+      </w:r>
+      <w:r>
+        <w:rPr>
+          <w:rFonts w:ascii="Times New Roman" w:hAnsi="Times New Roman"/>
+          <w:b w:val="0"/>
+          <w:i w:val="0"/>
+          <w:sz w:val="24"/>
+          <w:u w:val="none"/>
+        </w:rPr>
+        <w:t>SO</w:t>
+      </w:r>
+      <w:r>
+        <w:rPr>
+          <w:rFonts w:ascii="Times New Roman" w:hAnsi="Times New Roman"/>
+          <w:b w:val="0"/>
+          <w:i w:val="0"/>
+          <w:sz w:val="24"/>
+          <w:u w:val="none"/>
+          <w:vertAlign w:val="subscript"/>
+        </w:rPr>
+        <w:t>4</w:t>
+      </w:r>
+      <w:r>
+        <w:rPr>
+          <w:rFonts w:ascii="Times New Roman" w:hAnsi="Times New Roman"/>
+          <w:b w:val="0"/>
+          <w:i w:val="0"/>
+          <w:sz w:val="24"/>
+          <w:u w:val="none"/>
+        </w:rPr>
+        <w:t xml:space="preserve"> loãng, t°) và thuỷ phân một chiều (xà phòng hoá) trong môi trường base (dung dịch kiềm NaOH, t°).</w:t>
+      </w:r>
+    </w:p>
+    <w:p>
+      <w:pPr>
+        <w:spacing w:before="20" w:after="40"/>
+      </w:pPr>
+      <w:r>
+        <w:rPr>
+          <w:rFonts w:ascii="Times New Roman" w:hAnsi="Times New Roman"/>
+          <w:b w:val="0"/>
+          <w:i w:val="0"/>
+          <w:sz w:val="24"/>
+          <w:u w:val="none"/>
+        </w:rPr>
+        <w:t>(c) SAI. Do phân tử không có liên kết O-H linh động nên X không tạo được liên kết hydrogen mạnh với nước, khiến ester rất ít tan trong nước.</w:t>
+      </w:r>
+    </w:p>
+    <w:p>
+      <w:pPr>
+        <w:spacing w:before="20" w:after="40"/>
+      </w:pPr>
+      <w:r>
+        <w:rPr>
+          <w:rFonts w:ascii="Times New Roman" w:hAnsi="Times New Roman"/>
+          <w:b w:val="0"/>
+          <w:i w:val="0"/>
+          <w:sz w:val="24"/>
+          <w:u w:val="none"/>
+        </w:rPr>
+        <w:t>(d) ĐÚNG. Trong phòng thí nghiệm, X được tổng hợp bằng phản ứng ester hoá giữa acetic acid (CH</w:t>
+      </w:r>
+      <w:r>
+        <w:rPr>
+          <w:rFonts w:ascii="Times New Roman" w:hAnsi="Times New Roman"/>
+          <w:b w:val="0"/>
+          <w:i w:val="0"/>
+          <w:sz w:val="24"/>
+          <w:u w:val="none"/>
+          <w:vertAlign w:val="subscript"/>
+        </w:rPr>
+        <w:t>3</w:t>
+      </w:r>
+      <w:r>
+        <w:rPr>
+          <w:rFonts w:ascii="Times New Roman" w:hAnsi="Times New Roman"/>
+          <w:b w:val="0"/>
+          <w:i w:val="0"/>
+          <w:sz w:val="24"/>
+          <w:u w:val="none"/>
+        </w:rPr>
+        <w:t>COOH) và 2-methylbutan-1-ol (CH</w:t>
+      </w:r>
+      <w:r>
+        <w:rPr>
+          <w:rFonts w:ascii="Times New Roman" w:hAnsi="Times New Roman"/>
+          <w:b w:val="0"/>
+          <w:i w:val="0"/>
+          <w:sz w:val="24"/>
+          <w:u w:val="none"/>
+          <w:vertAlign w:val="subscript"/>
+        </w:rPr>
+        <w:t>3</w:t>
+      </w:r>
+      <w:r>
+        <w:rPr>
+          <w:rFonts w:ascii="Times New Roman" w:hAnsi="Times New Roman"/>
+          <w:b w:val="0"/>
+          <w:i w:val="0"/>
+          <w:sz w:val="24"/>
+          <w:u w:val="none"/>
+        </w:rPr>
+        <w:t>CH</w:t>
+      </w:r>
+      <w:r>
+        <w:rPr>
+          <w:rFonts w:ascii="Times New Roman" w:hAnsi="Times New Roman"/>
+          <w:b w:val="0"/>
+          <w:i w:val="0"/>
+          <w:sz w:val="24"/>
+          <w:u w:val="none"/>
+          <w:vertAlign w:val="subscript"/>
+        </w:rPr>
+        <w:t>2</w:t>
+      </w:r>
+      <w:r>
+        <w:rPr>
+          <w:rFonts w:ascii="Times New Roman" w:hAnsi="Times New Roman"/>
+          <w:b w:val="0"/>
+          <w:i w:val="0"/>
+          <w:sz w:val="24"/>
+          <w:u w:val="none"/>
+        </w:rPr>
+        <w:t>CH(CH</w:t>
+      </w:r>
+      <w:r>
+        <w:rPr>
+          <w:rFonts w:ascii="Times New Roman" w:hAnsi="Times New Roman"/>
+          <w:b w:val="0"/>
+          <w:i w:val="0"/>
+          <w:sz w:val="24"/>
+          <w:u w:val="none"/>
+          <w:vertAlign w:val="subscript"/>
+        </w:rPr>
+        <w:t>3</w:t>
+      </w:r>
+      <w:r>
+        <w:rPr>
+          <w:rFonts w:ascii="Times New Roman" w:hAnsi="Times New Roman"/>
+          <w:b w:val="0"/>
+          <w:i w:val="0"/>
+          <w:sz w:val="24"/>
+          <w:u w:val="none"/>
+        </w:rPr>
+        <w:t>)CH</w:t>
+      </w:r>
+      <w:r>
+        <w:rPr>
+          <w:rFonts w:ascii="Times New Roman" w:hAnsi="Times New Roman"/>
+          <w:b w:val="0"/>
+          <w:i w:val="0"/>
+          <w:sz w:val="24"/>
+          <w:u w:val="none"/>
+          <w:vertAlign w:val="subscript"/>
+        </w:rPr>
+        <w:t>2</w:t>
+      </w:r>
+      <w:r>
+        <w:rPr>
+          <w:rFonts w:ascii="Times New Roman" w:hAnsi="Times New Roman"/>
+          <w:b w:val="0"/>
+          <w:i w:val="0"/>
+          <w:sz w:val="24"/>
+          <w:u w:val="none"/>
+        </w:rPr>
+        <w:t>OH) với xúc tác H</w:t>
+      </w:r>
+      <w:r>
+        <w:rPr>
+          <w:rFonts w:ascii="Times New Roman" w:hAnsi="Times New Roman"/>
+          <w:b w:val="0"/>
+          <w:i w:val="0"/>
+          <w:sz w:val="24"/>
+          <w:u w:val="none"/>
+          <w:vertAlign w:val="subscript"/>
+        </w:rPr>
+        <w:t>2</w:t>
+      </w:r>
+      <w:r>
+        <w:rPr>
+          <w:rFonts w:ascii="Times New Roman" w:hAnsi="Times New Roman"/>
+          <w:b w:val="0"/>
+          <w:i w:val="0"/>
+          <w:sz w:val="24"/>
+          <w:u w:val="none"/>
+        </w:rPr>
+        <w:t>SO</w:t>
+      </w:r>
+      <w:r>
+        <w:rPr>
+          <w:rFonts w:ascii="Times New Roman" w:hAnsi="Times New Roman"/>
+          <w:b w:val="0"/>
+          <w:i w:val="0"/>
+          <w:sz w:val="24"/>
+          <w:u w:val="none"/>
+          <w:vertAlign w:val="subscript"/>
+        </w:rPr>
+        <w:t>4</w:t>
+      </w:r>
+      <w:r>
+        <w:rPr>
+          <w:rFonts w:ascii="Times New Roman" w:hAnsi="Times New Roman"/>
+          <w:b w:val="0"/>
+          <w:i w:val="0"/>
+          <w:sz w:val="24"/>
+          <w:u w:val="none"/>
+        </w:rPr>
+        <w:t xml:space="preserve"> đặc, đun nóng:</w:t>
+      </w:r>
+    </w:p>
+    <w:p>
+      <w:pPr>
+        <w:spacing w:before="20" w:after="40"/>
+      </w:pPr>
+      <w:r>
+        <w:rPr>
+          <w:rFonts w:ascii="Times New Roman" w:hAnsi="Times New Roman"/>
+          <w:b w:val="0"/>
+          <w:i w:val="0"/>
+          <w:sz w:val="24"/>
+          <w:u w:val="none"/>
+        </w:rPr>
+        <w:t>CH</w:t>
+      </w:r>
+      <w:r>
+        <w:rPr>
+          <w:rFonts w:ascii="Times New Roman" w:hAnsi="Times New Roman"/>
+          <w:b w:val="0"/>
+          <w:i w:val="0"/>
+          <w:sz w:val="24"/>
+          <w:u w:val="none"/>
+          <w:vertAlign w:val="subscript"/>
+        </w:rPr>
+        <w:t>3</w:t>
+      </w:r>
+      <w:r>
+        <w:rPr>
+          <w:rFonts w:ascii="Times New Roman" w:hAnsi="Times New Roman"/>
+          <w:b w:val="0"/>
+          <w:i w:val="0"/>
+          <w:sz w:val="24"/>
+          <w:u w:val="none"/>
+        </w:rPr>
+        <w:t>COOH + CH</w:t>
+      </w:r>
+      <w:r>
+        <w:rPr>
+          <w:rFonts w:ascii="Times New Roman" w:hAnsi="Times New Roman"/>
+          <w:b w:val="0"/>
+          <w:i w:val="0"/>
+          <w:sz w:val="24"/>
+          <w:u w:val="none"/>
+          <w:vertAlign w:val="subscript"/>
+        </w:rPr>
+        <w:t>3</w:t>
+      </w:r>
+      <w:r>
+        <w:rPr>
+          <w:rFonts w:ascii="Times New Roman" w:hAnsi="Times New Roman"/>
+          <w:b w:val="0"/>
+          <w:i w:val="0"/>
+          <w:sz w:val="24"/>
+          <w:u w:val="none"/>
+        </w:rPr>
+        <w:t>CH</w:t>
+      </w:r>
+      <w:r>
+        <w:rPr>
+          <w:rFonts w:ascii="Times New Roman" w:hAnsi="Times New Roman"/>
+          <w:b w:val="0"/>
+          <w:i w:val="0"/>
+          <w:sz w:val="24"/>
+          <w:u w:val="none"/>
+          <w:vertAlign w:val="subscript"/>
+        </w:rPr>
+        <w:t>2</w:t>
+      </w:r>
+      <w:r>
+        <w:rPr>
+          <w:rFonts w:ascii="Times New Roman" w:hAnsi="Times New Roman"/>
+          <w:b w:val="0"/>
+          <w:i w:val="0"/>
+          <w:sz w:val="24"/>
+          <w:u w:val="none"/>
+        </w:rPr>
+        <w:t>CH(CH</w:t>
+      </w:r>
+      <w:r>
+        <w:rPr>
+          <w:rFonts w:ascii="Times New Roman" w:hAnsi="Times New Roman"/>
+          <w:b w:val="0"/>
+          <w:i w:val="0"/>
+          <w:sz w:val="24"/>
+          <w:u w:val="none"/>
+          <w:vertAlign w:val="subscript"/>
+        </w:rPr>
+        <w:t>3</w:t>
+      </w:r>
+      <w:r>
+        <w:rPr>
+          <w:rFonts w:ascii="Times New Roman" w:hAnsi="Times New Roman"/>
+          <w:b w:val="0"/>
+          <w:i w:val="0"/>
+          <w:sz w:val="24"/>
+          <w:u w:val="none"/>
+        </w:rPr>
+        <w:t>)CH</w:t>
+      </w:r>
+      <w:r>
+        <w:rPr>
+          <w:rFonts w:ascii="Times New Roman" w:hAnsi="Times New Roman"/>
+          <w:b w:val="0"/>
+          <w:i w:val="0"/>
+          <w:sz w:val="24"/>
+          <w:u w:val="none"/>
+          <w:vertAlign w:val="subscript"/>
+        </w:rPr>
+        <w:t>2</w:t>
+      </w:r>
+      <w:r>
+        <w:rPr>
+          <w:rFonts w:ascii="Times New Roman" w:hAnsi="Times New Roman"/>
+          <w:b w:val="0"/>
+          <w:i w:val="0"/>
+          <w:sz w:val="24"/>
+          <w:u w:val="none"/>
+        </w:rPr>
+        <w:t>OH &lt;=&gt; CH</w:t>
+      </w:r>
+      <w:r>
+        <w:rPr>
+          <w:rFonts w:ascii="Times New Roman" w:hAnsi="Times New Roman"/>
+          <w:b w:val="0"/>
+          <w:i w:val="0"/>
+          <w:sz w:val="24"/>
+          <w:u w:val="none"/>
+          <w:vertAlign w:val="subscript"/>
+        </w:rPr>
+        <w:t>3</w:t>
+      </w:r>
+      <w:r>
+        <w:rPr>
+          <w:rFonts w:ascii="Times New Roman" w:hAnsi="Times New Roman"/>
+          <w:b w:val="0"/>
+          <w:i w:val="0"/>
+          <w:sz w:val="24"/>
+          <w:u w:val="none"/>
+        </w:rPr>
+        <w:t>COOCH</w:t>
+      </w:r>
+      <w:r>
+        <w:rPr>
+          <w:rFonts w:ascii="Times New Roman" w:hAnsi="Times New Roman"/>
+          <w:b w:val="0"/>
+          <w:i w:val="0"/>
+          <w:sz w:val="24"/>
+          <w:u w:val="none"/>
+          <w:vertAlign w:val="subscript"/>
+        </w:rPr>
+        <w:t>2</w:t>
+      </w:r>
+      <w:r>
+        <w:rPr>
+          <w:rFonts w:ascii="Times New Roman" w:hAnsi="Times New Roman"/>
+          <w:b w:val="0"/>
+          <w:i w:val="0"/>
+          <w:sz w:val="24"/>
+          <w:u w:val="none"/>
+        </w:rPr>
+        <w:t>CH(CH</w:t>
+      </w:r>
+      <w:r>
+        <w:rPr>
+          <w:rFonts w:ascii="Times New Roman" w:hAnsi="Times New Roman"/>
+          <w:b w:val="0"/>
+          <w:i w:val="0"/>
+          <w:sz w:val="24"/>
+          <w:u w:val="none"/>
+          <w:vertAlign w:val="subscript"/>
+        </w:rPr>
+        <w:t>3</w:t>
+      </w:r>
+      <w:r>
+        <w:rPr>
+          <w:rFonts w:ascii="Times New Roman" w:hAnsi="Times New Roman"/>
+          <w:b w:val="0"/>
+          <w:i w:val="0"/>
+          <w:sz w:val="24"/>
+          <w:u w:val="none"/>
+        </w:rPr>
+        <w:t>)CH</w:t>
+      </w:r>
+      <w:r>
+        <w:rPr>
+          <w:rFonts w:ascii="Times New Roman" w:hAnsi="Times New Roman"/>
+          <w:b w:val="0"/>
+          <w:i w:val="0"/>
+          <w:sz w:val="24"/>
+          <w:u w:val="none"/>
+          <w:vertAlign w:val="subscript"/>
+        </w:rPr>
+        <w:t>2</w:t>
+      </w:r>
+      <w:r>
+        <w:rPr>
+          <w:rFonts w:ascii="Times New Roman" w:hAnsi="Times New Roman"/>
+          <w:b w:val="0"/>
+          <w:i w:val="0"/>
+          <w:sz w:val="24"/>
+          <w:u w:val="none"/>
+        </w:rPr>
+        <w:t>CH</w:t>
+      </w:r>
+      <w:r>
+        <w:rPr>
+          <w:rFonts w:ascii="Times New Roman" w:hAnsi="Times New Roman"/>
+          <w:b w:val="0"/>
+          <w:i w:val="0"/>
+          <w:sz w:val="24"/>
+          <w:u w:val="none"/>
+          <w:vertAlign w:val="subscript"/>
+        </w:rPr>
+        <w:t>3</w:t>
+      </w:r>
+      <w:r>
+        <w:rPr>
+          <w:rFonts w:ascii="Times New Roman" w:hAnsi="Times New Roman"/>
+          <w:b w:val="0"/>
+          <w:i w:val="0"/>
+          <w:sz w:val="24"/>
+          <w:u w:val="none"/>
+        </w:rPr>
+        <w:t xml:space="preserve"> + H</w:t>
+      </w:r>
+      <w:r>
+        <w:rPr>
+          <w:rFonts w:ascii="Times New Roman" w:hAnsi="Times New Roman"/>
+          <w:b w:val="0"/>
+          <w:i w:val="0"/>
+          <w:sz w:val="24"/>
+          <w:u w:val="none"/>
+          <w:vertAlign w:val="subscript"/>
+        </w:rPr>
+        <w:t>2</w:t>
+      </w:r>
+      <w:r>
+        <w:rPr>
+          <w:rFonts w:ascii="Times New Roman" w:hAnsi="Times New Roman"/>
+          <w:b w:val="0"/>
+          <w:i w:val="0"/>
+          <w:sz w:val="24"/>
+          <w:u w:val="none"/>
+        </w:rPr>
+        <w:t>O.</w:t>
+      </w:r>
+    </w:p>
+    <w:p>
+      <w:pPr>
+        <w:spacing w:before="20" w:after="40"/>
+      </w:pPr>
+      <w:r>
+        <w:rPr>
+          <w:rFonts w:ascii="Times New Roman" w:hAnsi="Times New Roman"/>
+          <w:b w:val="0"/>
+          <w:i w:val="0"/>
+          <w:sz w:val="24"/>
+          <w:u w:val="none"/>
+        </w:rPr>
+        <w:t>➔ Số nhận định đúng là 3 gồm (a), (b), (d).</w:t>
+      </w:r>
+    </w:p>
+    <w:p>
+      <w:pPr>
+        <w:spacing w:before="20" w:after="40"/>
+      </w:pPr>
+      <w:r>
+        <w:rPr>
+          <w:rFonts w:ascii="Times New Roman" w:hAnsi="Times New Roman"/>
+          <w:b w:val="0"/>
+          <w:i w:val="0"/>
+          <w:sz w:val="24"/>
+          <w:u w:val="none"/>
+        </w:rPr>
+        <w:t>➔ Chọn đáp án A.</w:t>
       </w:r>
     </w:p>
     <w:p>
@@ -6165,6 +6913,46 @@
         <w:t xml:space="preserve"> đặc được dùng làm chất xúc tác. Sau thí nghiệm, tiến hành phân tách sản phẩm. Ghi phổ hồng ngoại của benzyl hexanoate, hexanoic acid và benzyl alcohol. Cho biết số sóng hấp thụ đặc trưng của một số liên kết trên phổ hồng ngoại như sau:</w:t>
       </w:r>
     </w:p>
+    <w:p>
+      <w:pPr>
+        <w:spacing w:before="40" w:after="40"/>
+        <w:jc w:val="center"/>
+      </w:pPr>
+      <w:r>
+        <w:drawing>
+          <wp:inline xmlns:a="http://schemas.openxmlformats.org/drawingml/2006/main" xmlns:pic="http://schemas.openxmlformats.org/drawingml/2006/picture">
+            <wp:extent cx="3060000" cy="262003"/>
+            <wp:docPr id="2" name="Picture 2"/>
+            <wp:cNvGraphicFramePr>
+              <a:graphicFrameLocks noChangeAspect="1"/>
+            </wp:cNvGraphicFramePr>
+            <a:graphic>
+              <a:graphicData uri="http://schemas.openxmlformats.org/drawingml/2006/picture">
+                <pic:pic>
+                  <pic:nvPicPr>
+                    <pic:cNvPr id="0" name="C1_Q117_1.png"/>
+                    <pic:cNvPicPr/>
+                  </pic:nvPicPr>
+                  <pic:blipFill>
+                    <a:blip r:embed="rId10"/>
+                    <a:stretch>
+                      <a:fillRect/>
+                    </a:stretch>
+                  </pic:blipFill>
+                  <pic:spPr>
+                    <a:xfrm>
+                      <a:off x="0" y="0"/>
+                      <a:ext cx="3060000" cy="262003"/>
+                    </a:xfrm>
+                    <a:prstGeom prst="rect"/>
+                  </pic:spPr>
+                </pic:pic>
+              </a:graphicData>
+            </a:graphic>
+          </wp:inline>
+        </w:drawing>
+      </w:r>
+    </w:p>
     <w:tbl>
       <w:tblPr>
         <w:tblW w:type="auto" w:w="0"/>
@@ -6997,46 +7785,6 @@
     <w:p>
       <w:pPr>
         <w:spacing w:before="40" w:after="40"/>
-        <w:jc w:val="center"/>
-      </w:pPr>
-      <w:r>
-        <w:drawing>
-          <wp:inline xmlns:a="http://schemas.openxmlformats.org/drawingml/2006/main" xmlns:pic="http://schemas.openxmlformats.org/drawingml/2006/picture">
-            <wp:extent cx="3060000" cy="2433321"/>
-            <wp:docPr id="1" name="Picture 1"/>
-            <wp:cNvGraphicFramePr>
-              <a:graphicFrameLocks noChangeAspect="1"/>
-            </wp:cNvGraphicFramePr>
-            <a:graphic>
-              <a:graphicData uri="http://schemas.openxmlformats.org/drawingml/2006/picture">
-                <pic:pic>
-                  <pic:nvPicPr>
-                    <pic:cNvPr id="0" name="c2_q252_img2.png"/>
-                    <pic:cNvPicPr/>
-                  </pic:nvPicPr>
-                  <pic:blipFill>
-                    <a:blip r:embed="rId9"/>
-                    <a:stretch>
-                      <a:fillRect/>
-                    </a:stretch>
-                  </pic:blipFill>
-                  <pic:spPr>
-                    <a:xfrm>
-                      <a:off x="0" y="0"/>
-                      <a:ext cx="3060000" cy="2433321"/>
-                    </a:xfrm>
-                    <a:prstGeom prst="rect"/>
-                  </pic:spPr>
-                </pic:pic>
-              </a:graphicData>
-            </a:graphic>
-          </wp:inline>
-        </w:drawing>
-      </w:r>
-    </w:p>
-    <w:p>
-      <w:pPr>
-        <w:spacing w:before="40" w:after="40"/>
       </w:pPr>
       <w:r>
         <w:rPr>
@@ -7274,7 +8022,7 @@
         <w:drawing>
           <wp:inline xmlns:a="http://schemas.openxmlformats.org/drawingml/2006/main" xmlns:pic="http://schemas.openxmlformats.org/drawingml/2006/picture">
             <wp:extent cx="3060000" cy="1441731"/>
-            <wp:docPr id="2" name="Picture 2"/>
+            <wp:docPr id="3" name="Picture 3"/>
             <wp:cNvGraphicFramePr>
               <a:graphicFrameLocks noChangeAspect="1"/>
             </wp:cNvGraphicFramePr>
@@ -7286,7 +8034,7 @@
                     <pic:cNvPicPr/>
                   </pic:nvPicPr>
                   <pic:blipFill>
-                    <a:blip r:embed="rId10"/>
+                    <a:blip r:embed="rId11"/>
                     <a:stretch>
                       <a:fillRect/>
                     </a:stretch>

</xml_diff>

<commit_message>
Cap nhat Cau 13 C2-P1-NB-220: Tinh bot trong nong san theo dung anh yeu cau cua nguoi dung
</commit_message>
<xml_diff>
--- a/San_Pham/De_Kiem_Tra_GK1_Hoa_12_De20_Azota.docx
+++ b/San_Pham/De_Kiem_Tra_GK1_Hoa_12_De20_Azota.docx
@@ -4499,21 +4499,9 @@
       <w:r>
         <w:rPr>
           <w:rFonts w:ascii="Times New Roman" w:hAnsi="Times New Roman"/>
-          <w:b/>
-          <w:color w:val="0000FF"/>
-          <w:sz w:val="24"/>
-        </w:rPr>
-        <w:t xml:space="preserve">Câu 13. </w:t>
-      </w:r>
-      <w:r>
-        <w:rPr>
-          <w:rFonts w:ascii="Times New Roman" w:hAnsi="Times New Roman"/>
-          <w:b w:val="0"/>
-          <w:i w:val="0"/>
-          <w:sz w:val="24"/>
-          <w:u w:val="none"/>
-        </w:rPr>
-        <w:t>Tinh bột là sản phẩm quang hóa của cây xanh và được dự trữ trong các loại hạt, củ, quả,… Trong các loại nông sản: hạt gạo, hạt lúa mạch, củ khoai lang, củ sắn, loại nào có chứa hàm lượng tinh bột cao nhất?</w:t>
+          <w:sz w:val="24"/>
+        </w:rPr>
+        <w:t>Câu 13. Tinh bột là sản phẩm quang hóa của cây xanh và được dự trữ trong các loại hạt, củ, quả,... Loại nông sản nào sau đây có chứa hàm lượng tinh bột cao nhất?</w:t>
       </w:r>
     </w:p>
     <w:p>
@@ -4524,62 +4512,73 @@
         <w:spacing w:before="40" w:after="40"/>
         <w:ind w:left="283"/>
       </w:pPr>
+      <w:r/>
       <w:r>
         <w:rPr>
           <w:rFonts w:ascii="Times New Roman" w:hAnsi="Times New Roman"/>
           <w:b/>
-          <w:color w:val="0000FF"/>
-          <w:sz w:val="24"/>
-          <w:u w:val="none"/>
-        </w:rPr>
-        <w:t>A.</w:t>
-      </w:r>
-      <w:r>
-        <w:rPr>
-          <w:rFonts w:ascii="Times New Roman" w:hAnsi="Times New Roman"/>
-          <w:sz w:val="24"/>
-        </w:rPr>
-        <w:t xml:space="preserve"> </w:t>
-      </w:r>
-      <w:r>
-        <w:rPr>
-          <w:rFonts w:ascii="Times New Roman" w:hAnsi="Times New Roman"/>
-          <w:b w:val="0"/>
-          <w:i w:val="0"/>
-          <w:sz w:val="24"/>
-          <w:u w:val="none"/>
-        </w:rPr>
-        <w:t>Hạt lúa mạch.</w:t>
-      </w:r>
-      <w:r>
+          <w:color w:val="0066CC"/>
+          <w:sz w:val="24"/>
+        </w:rPr>
+        <w:t xml:space="preserve">A. </w:t>
+      </w:r>
+      <w:r>
+        <w:rPr>
+          <w:rFonts w:ascii="Times New Roman" w:hAnsi="Times New Roman"/>
+          <w:sz w:val="24"/>
+        </w:rPr>
+        <w:t>Rau răm.</w:t>
         <w:tab/>
       </w:r>
       <w:r>
         <w:rPr>
           <w:rFonts w:ascii="Times New Roman" w:hAnsi="Times New Roman"/>
           <w:b/>
-          <w:color w:val="0000FF"/>
-          <w:sz w:val="24"/>
-          <w:u w:val="single"/>
-        </w:rPr>
-        <w:t>B.</w:t>
-      </w:r>
-      <w:r>
-        <w:rPr>
-          <w:rFonts w:ascii="Times New Roman" w:hAnsi="Times New Roman"/>
-          <w:sz w:val="24"/>
-        </w:rPr>
-        <w:t xml:space="preserve"> </w:t>
-      </w:r>
-      <w:r>
-        <w:rPr>
-          <w:rFonts w:ascii="Times New Roman" w:hAnsi="Times New Roman"/>
-          <w:b w:val="0"/>
-          <w:i w:val="0"/>
-          <w:sz w:val="24"/>
-          <w:u w:val="none"/>
+          <w:color w:val="0066CC"/>
+          <w:sz w:val="24"/>
+        </w:rPr>
+        <w:t xml:space="preserve">B. </w:t>
+      </w:r>
+      <w:r>
+        <w:rPr>
+          <w:rFonts w:ascii="Times New Roman" w:hAnsi="Times New Roman"/>
+          <w:sz w:val="24"/>
         </w:rPr>
         <w:t>Hạt gạo.</w:t>
+        <w:tab/>
+      </w:r>
+      <w:r>
+        <w:rPr>
+          <w:rFonts w:ascii="Times New Roman" w:hAnsi="Times New Roman"/>
+          <w:b/>
+          <w:color w:val="0066CC"/>
+          <w:sz w:val="24"/>
+        </w:rPr>
+        <w:t xml:space="preserve">C. </w:t>
+      </w:r>
+      <w:r>
+        <w:rPr>
+          <w:rFonts w:ascii="Times New Roman" w:hAnsi="Times New Roman"/>
+          <w:sz w:val="24"/>
+        </w:rPr>
+        <w:t>Hạt óc chó.</w:t>
+        <w:tab/>
+      </w:r>
+      <w:r>
+        <w:rPr>
+          <w:rFonts w:ascii="Times New Roman" w:hAnsi="Times New Roman"/>
+          <w:b/>
+          <w:color w:val="0066CC"/>
+          <w:sz w:val="24"/>
+        </w:rPr>
+        <w:t xml:space="preserve">D. </w:t>
+      </w:r>
+      <w:r>
+        <w:rPr>
+          <w:rFonts w:ascii="Times New Roman" w:hAnsi="Times New Roman"/>
+          <w:sz w:val="24"/>
+        </w:rPr>
+        <w:t>Quả nho chín.</w:t>
       </w:r>
     </w:p>
     <w:p>

</xml_diff>

<commit_message>
Bo sung phuong trinh dieu che benzyl hexanoate va hoan thien loi giai cho Cau 1 Phan II C1-P2-TH-117
</commit_message>
<xml_diff>
--- a/San_Pham/De_Kiem_Tra_GK1_Hoa_12_De20_Azota.docx
+++ b/San_Pham/De_Kiem_Tra_GK1_Hoa_12_De20_Azota.docx
@@ -4499,9 +4499,21 @@
       <w:r>
         <w:rPr>
           <w:rFonts w:ascii="Times New Roman" w:hAnsi="Times New Roman"/>
-          <w:sz w:val="24"/>
-        </w:rPr>
-        <w:t>Câu 13. Tinh bột là sản phẩm quang hóa của cây xanh và được dự trữ trong các loại hạt, củ, quả,... Loại nông sản nào sau đây có chứa hàm lượng tinh bột cao nhất?</w:t>
+          <w:b/>
+          <w:color w:val="0000FF"/>
+          <w:sz w:val="24"/>
+        </w:rPr>
+        <w:t xml:space="preserve">Câu 13. </w:t>
+      </w:r>
+      <w:r>
+        <w:rPr>
+          <w:rFonts w:ascii="Times New Roman" w:hAnsi="Times New Roman"/>
+          <w:b w:val="0"/>
+          <w:i w:val="0"/>
+          <w:sz w:val="24"/>
+          <w:u w:val="none"/>
+        </w:rPr>
+        <w:t>Tinh bột là sản phẩm quang hóa của cây xanh và được dự trữ trong các loại hạt, củ, quả,... Loại nông sản nào sau đây có chứa hàm lượng tinh bột cao nhất?</w:t>
       </w:r>
     </w:p>
     <w:p>
@@ -4512,73 +4524,62 @@
         <w:spacing w:before="40" w:after="40"/>
         <w:ind w:left="283"/>
       </w:pPr>
-      <w:r/>
       <w:r>
         <w:rPr>
           <w:rFonts w:ascii="Times New Roman" w:hAnsi="Times New Roman"/>
           <w:b/>
-          <w:color w:val="0066CC"/>
-          <w:sz w:val="24"/>
-        </w:rPr>
-        <w:t xml:space="preserve">A. </w:t>
-      </w:r>
-      <w:r>
-        <w:rPr>
-          <w:rFonts w:ascii="Times New Roman" w:hAnsi="Times New Roman"/>
-          <w:sz w:val="24"/>
+          <w:color w:val="0000FF"/>
+          <w:sz w:val="24"/>
+          <w:u w:val="none"/>
+        </w:rPr>
+        <w:t>A.</w:t>
+      </w:r>
+      <w:r>
+        <w:rPr>
+          <w:rFonts w:ascii="Times New Roman" w:hAnsi="Times New Roman"/>
+          <w:sz w:val="24"/>
+        </w:rPr>
+        <w:t xml:space="preserve"> </w:t>
+      </w:r>
+      <w:r>
+        <w:rPr>
+          <w:rFonts w:ascii="Times New Roman" w:hAnsi="Times New Roman"/>
+          <w:b w:val="0"/>
+          <w:i w:val="0"/>
+          <w:sz w:val="24"/>
+          <w:u w:val="none"/>
         </w:rPr>
         <w:t>Rau răm.</w:t>
+      </w:r>
+      <w:r>
         <w:tab/>
       </w:r>
       <w:r>
         <w:rPr>
           <w:rFonts w:ascii="Times New Roman" w:hAnsi="Times New Roman"/>
           <w:b/>
-          <w:color w:val="0066CC"/>
-          <w:sz w:val="24"/>
-        </w:rPr>
-        <w:t xml:space="preserve">B. </w:t>
-      </w:r>
-      <w:r>
-        <w:rPr>
-          <w:rFonts w:ascii="Times New Roman" w:hAnsi="Times New Roman"/>
-          <w:sz w:val="24"/>
+          <w:color w:val="0000FF"/>
+          <w:sz w:val="24"/>
+          <w:u w:val="single"/>
+        </w:rPr>
+        <w:t>B.</w:t>
+      </w:r>
+      <w:r>
+        <w:rPr>
+          <w:rFonts w:ascii="Times New Roman" w:hAnsi="Times New Roman"/>
+          <w:sz w:val="24"/>
+        </w:rPr>
+        <w:t xml:space="preserve"> </w:t>
+      </w:r>
+      <w:r>
+        <w:rPr>
+          <w:rFonts w:ascii="Times New Roman" w:hAnsi="Times New Roman"/>
+          <w:b w:val="0"/>
+          <w:i w:val="0"/>
+          <w:sz w:val="24"/>
+          <w:u w:val="none"/>
         </w:rPr>
         <w:t>Hạt gạo.</w:t>
-        <w:tab/>
-      </w:r>
-      <w:r>
-        <w:rPr>
-          <w:rFonts w:ascii="Times New Roman" w:hAnsi="Times New Roman"/>
-          <w:b/>
-          <w:color w:val="0066CC"/>
-          <w:sz w:val="24"/>
-        </w:rPr>
-        <w:t xml:space="preserve">C. </w:t>
-      </w:r>
-      <w:r>
-        <w:rPr>
-          <w:rFonts w:ascii="Times New Roman" w:hAnsi="Times New Roman"/>
-          <w:sz w:val="24"/>
-        </w:rPr>
-        <w:t>Hạt óc chó.</w:t>
-        <w:tab/>
-      </w:r>
-      <w:r>
-        <w:rPr>
-          <w:rFonts w:ascii="Times New Roman" w:hAnsi="Times New Roman"/>
-          <w:b/>
-          <w:color w:val="0066CC"/>
-          <w:sz w:val="24"/>
-        </w:rPr>
-        <w:t xml:space="preserve">D. </w:t>
-      </w:r>
-      <w:r>
-        <w:rPr>
-          <w:rFonts w:ascii="Times New Roman" w:hAnsi="Times New Roman"/>
-          <w:sz w:val="24"/>
-        </w:rPr>
-        <w:t>Quả nho chín.</w:t>
       </w:r>
     </w:p>
     <w:p>
@@ -4614,7 +4615,7 @@
           <w:sz w:val="24"/>
           <w:u w:val="none"/>
         </w:rPr>
-        <w:t>Củ khoai lang.</w:t>
+        <w:t>Hạt óc chó.</w:t>
       </w:r>
       <w:r>
         <w:tab/>
@@ -4644,7 +4645,7 @@
           <w:sz w:val="24"/>
           <w:u w:val="none"/>
         </w:rPr>
-        <w:t>Củ sắn.</w:t>
+        <w:t>Quả nho chín.</w:t>
       </w:r>
     </w:p>
     <w:p>
@@ -4671,7 +4672,7 @@
           <w:sz w:val="24"/>
           <w:u w:val="none"/>
         </w:rPr>
-        <w:t>Chọn đáp án B (Hạt gạo.).</w:t>
+        <w:t>Chọn đáp án B (Hạt gạo).</w:t>
       </w:r>
     </w:p>
     <w:p>
@@ -6857,70 +6858,13 @@
     </w:p>
     <w:p>
       <w:pPr>
-        <w:spacing w:before="20" w:after="40"/>
-      </w:pPr>
-      <w:r>
-        <w:rPr>
-          <w:rFonts w:ascii="Times New Roman" w:hAnsi="Times New Roman"/>
-          <w:b w:val="0"/>
-          <w:i w:val="0"/>
-          <w:sz w:val="24"/>
-          <w:u w:val="none"/>
-        </w:rPr>
-        <w:t>Trong một thí nghiệm tổng hợp benzyl heaxanoate theo phản ứng trên, từ 16,2 gam benzyl alcohol và 23,2 gam hexanoic acid, với hiệu suất phản ứng là h% thu được 18,54 gam benzyl heaxanoate. Biết H</w:t>
-      </w:r>
-      <w:r>
-        <w:rPr>
-          <w:rFonts w:ascii="Times New Roman" w:hAnsi="Times New Roman"/>
-          <w:b w:val="0"/>
-          <w:i w:val="0"/>
-          <w:sz w:val="24"/>
-          <w:u w:val="none"/>
-          <w:vertAlign w:val="subscript"/>
-        </w:rPr>
-        <w:t>2</w:t>
-      </w:r>
-      <w:r>
-        <w:rPr>
-          <w:rFonts w:ascii="Times New Roman" w:hAnsi="Times New Roman"/>
-          <w:b w:val="0"/>
-          <w:i w:val="0"/>
-          <w:sz w:val="24"/>
-          <w:u w:val="none"/>
-        </w:rPr>
-        <w:t>SO</w:t>
-      </w:r>
-      <w:r>
-        <w:rPr>
-          <w:rFonts w:ascii="Times New Roman" w:hAnsi="Times New Roman"/>
-          <w:b w:val="0"/>
-          <w:i w:val="0"/>
-          <w:sz w:val="24"/>
-          <w:u w:val="none"/>
-          <w:vertAlign w:val="subscript"/>
-        </w:rPr>
-        <w:t>4</w:t>
-      </w:r>
-      <w:r>
-        <w:rPr>
-          <w:rFonts w:ascii="Times New Roman" w:hAnsi="Times New Roman"/>
-          <w:b w:val="0"/>
-          <w:i w:val="0"/>
-          <w:sz w:val="24"/>
-          <w:u w:val="none"/>
-        </w:rPr>
-        <w:t xml:space="preserve"> đặc được dùng làm chất xúc tác. Sau thí nghiệm, tiến hành phân tách sản phẩm. Ghi phổ hồng ngoại của benzyl hexanoate, hexanoic acid và benzyl alcohol. Cho biết số sóng hấp thụ đặc trưng của một số liên kết trên phổ hồng ngoại như sau:</w:t>
-      </w:r>
-    </w:p>
-    <w:p>
-      <w:pPr>
         <w:spacing w:before="40" w:after="40"/>
         <w:jc w:val="center"/>
       </w:pPr>
       <w:r>
         <w:drawing>
           <wp:inline xmlns:a="http://schemas.openxmlformats.org/drawingml/2006/main" xmlns:pic="http://schemas.openxmlformats.org/drawingml/2006/picture">
-            <wp:extent cx="3060000" cy="262003"/>
+            <wp:extent cx="4500000" cy="385299"/>
             <wp:docPr id="2" name="Picture 2"/>
             <wp:cNvGraphicFramePr>
               <a:graphicFrameLocks noChangeAspect="1"/>
@@ -6941,7 +6885,7 @@
                   <pic:spPr>
                     <a:xfrm>
                       <a:off x="0" y="0"/>
-                      <a:ext cx="3060000" cy="262003"/>
+                      <a:ext cx="4500000" cy="385299"/>
                     </a:xfrm>
                     <a:prstGeom prst="rect"/>
                   </pic:spPr>
@@ -6950,6 +6894,63 @@
             </a:graphic>
           </wp:inline>
         </w:drawing>
+      </w:r>
+    </w:p>
+    <w:p>
+      <w:pPr>
+        <w:spacing w:before="20" w:after="40"/>
+      </w:pPr>
+      <w:r>
+        <w:rPr>
+          <w:rFonts w:ascii="Times New Roman" w:hAnsi="Times New Roman"/>
+          <w:b w:val="0"/>
+          <w:i w:val="0"/>
+          <w:sz w:val="24"/>
+          <w:u w:val="none"/>
+        </w:rPr>
+        <w:t>Trong một thí nghiệm tổng hợp benzyl heaxanoate theo phản ứng trên, từ 16,2 gam benzyl alcohol và 23,2 gam hexanoic acid, với hiệu suất phản ứng là h% thu được 18,54 gam benzyl heaxanoate. Biết H</w:t>
+      </w:r>
+      <w:r>
+        <w:rPr>
+          <w:rFonts w:ascii="Times New Roman" w:hAnsi="Times New Roman"/>
+          <w:b w:val="0"/>
+          <w:i w:val="0"/>
+          <w:sz w:val="24"/>
+          <w:u w:val="none"/>
+          <w:vertAlign w:val="subscript"/>
+        </w:rPr>
+        <w:t>2</w:t>
+      </w:r>
+      <w:r>
+        <w:rPr>
+          <w:rFonts w:ascii="Times New Roman" w:hAnsi="Times New Roman"/>
+          <w:b w:val="0"/>
+          <w:i w:val="0"/>
+          <w:sz w:val="24"/>
+          <w:u w:val="none"/>
+        </w:rPr>
+        <w:t>SO</w:t>
+      </w:r>
+      <w:r>
+        <w:rPr>
+          <w:rFonts w:ascii="Times New Roman" w:hAnsi="Times New Roman"/>
+          <w:b w:val="0"/>
+          <w:i w:val="0"/>
+          <w:sz w:val="24"/>
+          <w:u w:val="none"/>
+          <w:vertAlign w:val="subscript"/>
+        </w:rPr>
+        <w:t>4</w:t>
+      </w:r>
+      <w:r>
+        <w:rPr>
+          <w:rFonts w:ascii="Times New Roman" w:hAnsi="Times New Roman"/>
+          <w:b w:val="0"/>
+          <w:i w:val="0"/>
+          <w:sz w:val="24"/>
+          <w:u w:val="none"/>
+        </w:rPr>
+        <w:t xml:space="preserve"> đặc được dùng làm chất xúc tác. Sau thí nghiệm, tiến hành phân tách sản phẩm. Ghi phổ hồng ngoại của benzyl hexanoate, hexanoic acid và benzyl alcohol. Cho biết số sóng hấp thụ đặc trưng của một số liên kết trên phổ hồng ngoại như sau:</w:t>
       </w:r>
     </w:p>
     <w:tbl>
@@ -7331,7 +7332,28 @@
           <w:sz w:val="24"/>
           <w:u w:val="none"/>
         </w:rPr>
-        <w:t>a) Sai vì O-H (carboxylic acid) có số sóng trong khoảng 3300 – 2500.</w:t>
+        <w:t>a) Sai vì liên kết O-H của carboxylic acid có số sóng hấp thụ đặc trưng trong khoảng 3300 – 2500 cm</w:t>
+      </w:r>
+      <w:r>
+        <w:rPr>
+          <w:rFonts w:ascii="Times New Roman" w:hAnsi="Times New Roman"/>
+          <w:b w:val="0"/>
+          <w:i w:val="0"/>
+          <w:sz w:val="24"/>
+          <w:u w:val="none"/>
+          <w:vertAlign w:val="superscript"/>
+        </w:rPr>
+        <w:t>-1 (tín hiệu ở 1721 cm</w:t>
+      </w:r>
+      <w:r>
+        <w:rPr>
+          <w:rFonts w:ascii="Times New Roman" w:hAnsi="Times New Roman"/>
+          <w:b w:val="0"/>
+          <w:i w:val="0"/>
+          <w:sz w:val="24"/>
+          <w:u w:val="none"/>
+        </w:rPr>
+        <w:t>-1 là đặc trưng cho liên kết C=O của nhóm carbonyl trong carboxylic acid).</w:t>
       </w:r>
     </w:p>
     <w:p>
@@ -7361,7 +7383,7 @@
           <w:sz w:val="24"/>
           <w:u w:val="none"/>
         </w:rPr>
-        <w:t>Giả sử H = 100%, khi đó alcohol hết, sản phẩm lí thuyết tính theo alcohol.</w:t>
+        <w:t>n(benzyl alcohol) = 16,2 / 108 = 0,15 mol; n(hexanoic acid) = 23,2 / 116 = 0,20 mol.</w:t>
       </w:r>
     </w:p>
     <w:p>
@@ -7376,7 +7398,7 @@
           <w:sz w:val="24"/>
           <w:u w:val="none"/>
         </w:rPr>
-        <w:t>c) Sai vì benzyl alcohol đóng vai trò là một tác nhân nucleophile, không có sự nhường proton trong phản ứng này.</w:t>
+        <w:t>Do n(alcohol) &lt; n(acid) (tỉ lệ mol phản ứng 1 : 1) nên lượng ester lí thuyết tính theo benzyl alcohol.</w:t>
       </w:r>
     </w:p>
     <w:p>
@@ -7391,7 +7413,52 @@
           <w:sz w:val="24"/>
           <w:u w:val="none"/>
         </w:rPr>
-        <w:t>d) Sai vì phản ứng ester hóa không có sự thay đổi số oxi hóa.</w:t>
+        <w:t>Khối lượng benzyl hexanoate lí thuyết (H = 100%): m(lí thuyết) = 0,15 × 206 = 30,9 gam.</w:t>
+      </w:r>
+    </w:p>
+    <w:p>
+      <w:pPr>
+        <w:spacing w:before="20" w:after="40"/>
+      </w:pPr>
+      <w:r>
+        <w:rPr>
+          <w:rFonts w:ascii="Times New Roman" w:hAnsi="Times New Roman"/>
+          <w:b w:val="0"/>
+          <w:i w:val="0"/>
+          <w:sz w:val="24"/>
+          <w:u w:val="none"/>
+        </w:rPr>
+        <w:t>Hiệu suất phản ứng: h% = (18,54 / 30,9) × 100% = 60% =&gt; h = 60 (không phải 75).</w:t>
+      </w:r>
+    </w:p>
+    <w:p>
+      <w:pPr>
+        <w:spacing w:before="20" w:after="40"/>
+      </w:pPr>
+      <w:r>
+        <w:rPr>
+          <w:rFonts w:ascii="Times New Roman" w:hAnsi="Times New Roman"/>
+          <w:b w:val="0"/>
+          <w:i w:val="0"/>
+          <w:sz w:val="24"/>
+          <w:u w:val="none"/>
+        </w:rPr>
+        <w:t>c) Sai vì trong phản ứng ester hoá, benzyl alcohol đóng vai trò là tác nhân nucleophile tấn công vào carbon mang điện tích dương của nhóm carbonyl, không đóng vai trò acid theo thuyết Brønsted–Lowry.</w:t>
+      </w:r>
+    </w:p>
+    <w:p>
+      <w:pPr>
+        <w:spacing w:before="20" w:after="40"/>
+      </w:pPr>
+      <w:r>
+        <w:rPr>
+          <w:rFonts w:ascii="Times New Roman" w:hAnsi="Times New Roman"/>
+          <w:b w:val="0"/>
+          <w:i w:val="0"/>
+          <w:sz w:val="24"/>
+          <w:u w:val="none"/>
+        </w:rPr>
+        <w:t>d) Sai vì phản ứng ester hoá là phản ứng thế nhóm acyl, số oxi hoá của các nguyên tố đều không thay đổi nên hexanoic acid không đóng vai trò là chất oxi hoá.</w:t>
       </w:r>
     </w:p>
     <w:p>

</xml_diff>